<commit_message>
index & empower update
</commit_message>
<xml_diff>
--- a/docs/Empower_Brands_Readiness_Execution.docx
+++ b/docs/Empower_Brands_Readiness_Execution.docx
@@ -8121,190 +8121,6 @@
                 <w:sz w:val="16"/>
               </w:rPr>
               <w:t xml:space="preserve"/>
-            </w:r>
-          </w:p>
-        </w:tc>
-      </w:tr>
-      <w:tr>
-        <w:tc>
-          <w:tcPr>
-            <w:tcW w:w="1700" w:type="dxa"/>
-            <w:shd w:val="clear" w:color="auto" w:fill="D1FAE5"/>
-          </w:tcPr>
-          <w:p>
-            <w:pPr>
-              <w:spacing w:before="40" w:after="40"/>
-            </w:pPr>
-            <w:r>
-              <w:rPr>
-                <w:b/>
-                <w:bCs/>
-                <w:sz w:val="18"/>
-              </w:rPr>
-              <w:t xml:space="preserve">Hunt Davis</w:t>
-            </w:r>
-          </w:p>
-        </w:tc>
-        <w:tc>
-          <w:tcPr>
-            <w:tcW w:w="1900" w:type="dxa"/>
-            <w:shd w:val="clear" w:color="auto" w:fill="D1FAE5"/>
-          </w:tcPr>
-          <w:p>
-            <w:pPr>
-              <w:spacing w:before="40" w:after="40"/>
-            </w:pPr>
-            <w:r>
-              <w:rPr>
-                <w:sz w:val="18"/>
-              </w:rPr>
-              <w:t xml:space="preserve">Canopy CEO</w:t>
-            </w:r>
-          </w:p>
-        </w:tc>
-        <w:tc>
-          <w:tcPr>
-            <w:tcW w:w="1900" w:type="dxa"/>
-            <w:shd w:val="clear" w:color="auto" w:fill="D1FAE5"/>
-          </w:tcPr>
-          <w:p>
-            <w:pPr>
-              <w:spacing w:before="40" w:after="40"/>
-            </w:pPr>
-            <w:r>
-              <w:rPr>
-                <w:color w:val="185FA5"/>
-                <w:sz w:val="16"/>
-              </w:rPr>
-              <w:t xml:space="preserve">huntdavis</w:t>
-            </w:r>
-          </w:p>
-        </w:tc>
-        <w:tc>
-          <w:tcPr>
-            <w:tcW w:w="1700" w:type="dxa"/>
-            <w:shd w:val="clear" w:color="auto" w:fill="D1FAE5"/>
-          </w:tcPr>
-          <w:p>
-            <w:pPr>
-              <w:spacing w:before="40" w:after="40"/>
-            </w:pPr>
-            <w:r>
-              <w:rPr>
-                <w:sz w:val="16"/>
-              </w:rPr>
-              <w:t xml:space="preserve">NC State University BS ⭐⭐⭐ Cary NC. Ex-investment banker.</w:t>
-            </w:r>
-          </w:p>
-        </w:tc>
-        <w:tc>
-          <w:tcPr>
-            <w:tcW w:w="1800" w:type="dxa"/>
-            <w:shd w:val="clear" w:color="auto" w:fill="D1FAE5"/>
-          </w:tcPr>
-          <w:p>
-            <w:pPr>
-              <w:spacing w:before="40" w:after="40"/>
-            </w:pPr>
-            <w:r>
-              <w:rPr>
-                <w:i/>
-                <w:iCs/>
-                <w:sz w:val="16"/>
-              </w:rPr>
-              <w:t xml:space="preserve">I will be working an angle to get connected through existing relationships</w:t>
-            </w:r>
-          </w:p>
-        </w:tc>
-      </w:tr>
-      <w:tr>
-        <w:tc>
-          <w:tcPr>
-            <w:tcW w:w="1700" w:type="dxa"/>
-            <w:shd w:val="clear" w:color="auto" w:fill="D1FAE5"/>
-          </w:tcPr>
-          <w:p>
-            <w:pPr>
-              <w:spacing w:before="40" w:after="40"/>
-            </w:pPr>
-            <w:r>
-              <w:rPr>
-                <w:b/>
-                <w:bCs/>
-                <w:sz w:val="18"/>
-              </w:rPr>
-              <w:t xml:space="preserve">Ben Wright</w:t>
-            </w:r>
-          </w:p>
-        </w:tc>
-        <w:tc>
-          <w:tcPr>
-            <w:tcW w:w="1900" w:type="dxa"/>
-            <w:shd w:val="clear" w:color="auto" w:fill="D1FAE5"/>
-          </w:tcPr>
-          <w:p>
-            <w:pPr>
-              <w:spacing w:before="40" w:after="40"/>
-            </w:pPr>
-            <w:r>
-              <w:rPr>
-                <w:sz w:val="18"/>
-              </w:rPr>
-              <w:t xml:space="preserve">Canopy Pres</w:t>
-            </w:r>
-          </w:p>
-        </w:tc>
-        <w:tc>
-          <w:tcPr>
-            <w:tcW w:w="1900" w:type="dxa"/>
-            <w:shd w:val="clear" w:color="auto" w:fill="D1FAE5"/>
-          </w:tcPr>
-          <w:p>
-            <w:pPr>
-              <w:spacing w:before="40" w:after="40"/>
-            </w:pPr>
-            <w:r>
-              <w:rPr>
-                <w:color w:val="185FA5"/>
-                <w:sz w:val="16"/>
-              </w:rPr>
-              <w:t xml:space="preserve">benjamin-wright-43613729</w:t>
-            </w:r>
-          </w:p>
-        </w:tc>
-        <w:tc>
-          <w:tcPr>
-            <w:tcW w:w="1700" w:type="dxa"/>
-            <w:shd w:val="clear" w:color="auto" w:fill="D1FAE5"/>
-          </w:tcPr>
-          <w:p>
-            <w:pPr>
-              <w:spacing w:before="40" w:after="40"/>
-            </w:pPr>
-            <w:r>
-              <w:rPr>
-                <w:sz w:val="16"/>
-              </w:rPr>
-              <w:t xml:space="preserve">🎯🎯🎯 NC STATE University ⭐⭐⭐ Major: Landscaping/Horticulture. North Carolina-based.</w:t>
-            </w:r>
-          </w:p>
-        </w:tc>
-        <w:tc>
-          <w:tcPr>
-            <w:tcW w:w="1800" w:type="dxa"/>
-            <w:shd w:val="clear" w:color="auto" w:fill="D1FAE5"/>
-          </w:tcPr>
-          <w:p>
-            <w:pPr>
-              <w:spacing w:before="40" w:after="40"/>
-            </w:pPr>
-            <w:r>
-              <w:rPr>
-                <w:i/>
-                <w:iCs/>
-                <w:sz w:val="16"/>
-              </w:rPr>
-              <w:t xml:space="preserve">I will be working an angle to get connected through existing relationships</w:t>
             </w:r>
           </w:p>
         </w:tc>

</xml_diff>